<commit_message>
CS1105 Unit 3: add course-video sources with clickable links to discussion + assignment
Cite the two Unit 3 course videos (Computer Science, 2016 - SR latch;
Down to the Wires, 2020 - registers and counters) in-text and in the
alphabetized reference lists, alongside Ndjountche 2016, Mano & Ciletti
2018 (and Harris & Harris 2012 in the assignment). Video URLs left as an
explicit paste-in placeholder since the exact links must come from the
course page (not fabricated). Discussion stays at 749 words.
</commit_message>
<xml_diff>
--- a/CS1105_Digital_Electronics_Architecture/Unit3_Sequential_Logic/Assignment/Unit3_Assignment_Activity.docx
+++ b/CS1105_Digital_Electronics_Architecture/Unit3_Sequential_Logic/Assignment/Unit3_Assignment_Activity.docx
@@ -507,7 +507,7 @@
           <w:b w:val="0"/>
           <w:sz w:val="24"/>
         </w:rPr>
-        <w:t>The counter and the register perform complementary jobs, and the design needs both. A counter is a sequential circuit that advances through a fixed sequence of states on each clock pulse; it is the component that actually tallies the score and, being modulo-16, wraps back to zero after 15 (Ndjountche, 2016). A register, by contrast, does not count: it stores a word of data and holds it until told to load a new one. Placing a register after the counter separates counting from displaying. Without the register, the display would be tied directly to the counter and would flicker through every intermediate value as the count changed; with the register, the display updates only when a latch pulse loads the current count, so it shows a clean, stable number (Mano &amp; Ciletti, 2018).</w:t>
+        <w:t>The counter and the register perform complementary jobs, and the design needs both. A counter is a sequential circuit that advances through a fixed sequence of states on each clock pulse; it is the component that actually tallies the score and, being modulo-16, wraps back to zero after 15 (Ndjountche, 2016; Down to the Wires, 2020). A register, by contrast, does not count: it stores a word of data and holds it until told to load a new one. Placing a register after the counter separates counting from displaying. Without the register, the display would be tied directly to the counter and would flicker through every intermediate value as the count changed; with the register, the display updates only when a latch pulse loads the current count, so it shows a clean, stable number (Mano &amp; Ciletti, 2018).</w:t>
       </w:r>
     </w:p>
     <w:p>
@@ -684,7 +684,7 @@
           <w:i w:val="0"/>
           <w:sz w:val="24"/>
         </w:rPr>
-        <w:t xml:space="preserve">Ndjountche, T. (2016). </w:t>
+        <w:t xml:space="preserve">Down to the Wires. (2020, October 4). </w:t>
       </w:r>
       <w:r>
         <w:rPr>
@@ -692,7 +692,7 @@
           <w:i/>
           <w:sz w:val="24"/>
         </w:rPr>
-        <w:t>Digital electronics 2: Sequential and arithmetic logic circuits</w:t>
+        <w:t>Registers and counters</w:t>
       </w:r>
       <w:r>
         <w:rPr>
@@ -700,7 +700,37 @@
           <w:i w:val="0"/>
           <w:sz w:val="24"/>
         </w:rPr>
-        <w:t>. ISTE Ltd/John Wiley &amp; Sons. Retrieved from ProQuest Ebook Central via the UoPeople LIRN Library. https://ebookcentral.proquest.com/lib/univ-people-ebooks/</w:t>
+        <w:t xml:space="preserve"> [Video]. YouTube. [Paste the exact video URL from the Unit 3 reading list here]</w:t>
+      </w:r>
+    </w:p>
+    <w:p>
+      <w:pPr>
+        <w:spacing w:line="480" w:lineRule="auto" w:after="0"/>
+        <w:ind w:left="720" w:hanging="720"/>
+      </w:pPr>
+      <w:r>
+        <w:rPr>
+          <w:rFonts w:ascii="Times New Roman" w:hAnsi="Times New Roman"/>
+          <w:i w:val="0"/>
+          <w:sz w:val="24"/>
+        </w:rPr>
+        <w:t xml:space="preserve">Harris, D. M., &amp; Harris, S. L. (2012). </w:t>
+      </w:r>
+      <w:r>
+        <w:rPr>
+          <w:rFonts w:ascii="Times New Roman" w:hAnsi="Times New Roman"/>
+          <w:i/>
+          <w:sz w:val="24"/>
+        </w:rPr>
+        <w:t>Digital design and computer architecture</w:t>
+      </w:r>
+      <w:r>
+        <w:rPr>
+          <w:rFonts w:ascii="Times New Roman" w:hAnsi="Times New Roman"/>
+          <w:i w:val="0"/>
+          <w:sz w:val="24"/>
+        </w:rPr>
+        <w:t xml:space="preserve"> (2nd ed.). Morgan Kaufmann.</w:t>
       </w:r>
     </w:p>
     <w:p>
@@ -744,7 +774,7 @@
           <w:i w:val="0"/>
           <w:sz w:val="24"/>
         </w:rPr>
-        <w:t xml:space="preserve">Harris, D. M., &amp; Harris, S. L. (2012). </w:t>
+        <w:t xml:space="preserve">Ndjountche, T. (2016). </w:t>
       </w:r>
       <w:r>
         <w:rPr>
@@ -752,7 +782,7 @@
           <w:i/>
           <w:sz w:val="24"/>
         </w:rPr>
-        <w:t>Digital design and computer architecture</w:t>
+        <w:t>Digital electronics 2: Sequential and arithmetic logic circuits</w:t>
       </w:r>
       <w:r>
         <w:rPr>
@@ -760,7 +790,7 @@
           <w:i w:val="0"/>
           <w:sz w:val="24"/>
         </w:rPr>
-        <w:t xml:space="preserve"> (2nd ed.). Morgan Kaufmann.</w:t>
+        <w:t>. ISTE Ltd/John Wiley &amp; Sons. Retrieved from ProQuest Ebook Central via the UoPeople LIRN Library. https://ebookcentral.proquest.com/lib/univ-people-ebooks/</w:t>
       </w:r>
     </w:p>
     <w:sectPr>

</xml_diff>

<commit_message>
CS1105 Unit 3: finalize citations with verified links + add 3 peer replies
- Replace URL placeholders with verified links from the course video pages:
  SR latch https://youtu.be/-aQH0ybMd3U, Registers/counters
  https://youtu.be/ikrNRrIRyMk, Ndjountche DOI 10.1002/9781119318613
  (in both discussion and assignment)
- Add 3 substantive peer replies (need 2) to Nankya Joyce Sanyu, Rohith
  Dayalan, and Winny Makumbe - each engages their post, adds a technical
  point, answers their question, and cites a source.
</commit_message>
<xml_diff>
--- a/CS1105_Digital_Electronics_Architecture/Unit3_Sequential_Logic/Assignment/Unit3_Assignment_Activity.docx
+++ b/CS1105_Digital_Electronics_Architecture/Unit3_Sequential_Logic/Assignment/Unit3_Assignment_Activity.docx
@@ -700,7 +700,7 @@
           <w:i w:val="0"/>
           <w:sz w:val="24"/>
         </w:rPr>
-        <w:t xml:space="preserve"> [Video]. YouTube. [Paste the exact video URL from the Unit 3 reading list here]</w:t>
+        <w:t xml:space="preserve"> [Video]. YouTube. https://youtu.be/ikrNRrIRyMk</w:t>
       </w:r>
     </w:p>
     <w:p>
@@ -790,7 +790,7 @@
           <w:i w:val="0"/>
           <w:sz w:val="24"/>
         </w:rPr>
-        <w:t>. ISTE Ltd/John Wiley &amp; Sons. Retrieved from ProQuest Ebook Central via the UoPeople LIRN Library. https://ebookcentral.proquest.com/lib/univ-people-ebooks/</w:t>
+        <w:t>. ISTE Ltd/John Wiley &amp; Sons. https://doi.org/10.1002/9781119318613</w:t>
       </w:r>
     </w:p>
     <w:sectPr>

</xml_diff>